<commit_message>
Tweaked Product Guard prompt
</commit_message>
<xml_diff>
--- a/product-definitions/foundations-input/user-flows.docx
+++ b/product-definitions/foundations-input/user-flows.docx
@@ -178,7 +178,23 @@
       </w:pPr>
       <w:r>
         <w:rPr/>
-        <w:t>If there is any change (crud) detected in product input files</w:t>
+        <w:t xml:space="preserve">If there is any change (crud) detected in product input files </w:t>
+      </w:r>
+      <w:r>
+        <w:rPr/>
+        <w:t>the the Product Guard should run and create a report.</w:t>
+      </w:r>
+    </w:p>
+    <w:p>
+      <w:pPr>
+        <w:pStyle w:val="PreformattedText"/>
+        <w:bidi w:val="0"/>
+        <w:spacing w:before="0" w:after="0"/>
+        <w:jc w:val="start"/>
+        <w:rPr/>
+      </w:pPr>
+      <w:r>
+        <w:rPr/>
       </w:r>
     </w:p>
     <w:sectPr>
@@ -188,6 +204,7 @@
       <w:pgNumType w:fmt="decimal"/>
       <w:formProt w:val="false"/>
       <w:textDirection w:val="lrTb"/>
+      <w:docGrid w:type="default" w:linePitch="100" w:charSpace="0"/>
     </w:sectPr>
   </w:body>
 </w:document>
@@ -215,11 +232,15 @@
     <w:qFormat/>
     <w:pPr>
       <w:widowControl w:val="false"/>
+      <w:suppressAutoHyphens w:val="true"/>
       <w:bidi w:val="0"/>
+      <w:spacing w:before="0" w:after="0"/>
+      <w:jc w:val="start"/>
     </w:pPr>
     <w:rPr>
       <w:rFonts w:ascii="Liberation Serif" w:hAnsi="Liberation Serif" w:eastAsia="Noto Serif CJK SC" w:cs="Noto Sans Devanagari"/>
       <w:color w:val="auto"/>
+      <w:kern w:val="0"/>
       <w:sz w:val="24"/>
       <w:szCs w:val="24"/>
       <w:lang w:val="nl-NL" w:eastAsia="zh-CN" w:bidi="hi-IN"/>

</xml_diff>

<commit_message>
Update the Product Guard output page
</commit_message>
<xml_diff>
--- a/product-definitions/foundations-input/user-flows.docx
+++ b/product-definitions/foundations-input/user-flows.docx
@@ -216,7 +216,11 @@
       </w:pPr>
       <w:r>
         <w:rPr/>
-        <w:t>Checks features against the product description files</w:t>
+        <w:t xml:space="preserve">Checks features against the product description files </w:t>
+      </w:r>
+      <w:r>
+        <w:rPr/>
+        <w:t>and rates whether it is a good idea</w:t>
       </w:r>
     </w:p>
     <w:p>

</xml_diff>